<commit_message>
added comments to code and corrected TDD.
</commit_message>
<xml_diff>
--- a/EmmanuelLugo_ProgrammingExercise_7/EmmanuelLugo_ProgrammingExercise_7_TechDesignDoc.docx
+++ b/EmmanuelLugo_ProgrammingExercise_7/EmmanuelLugo_ProgrammingExercise_7_TechDesignDoc.docx
@@ -4,13 +4,7 @@
   <w:body>
     <w:p>
       <w:r>
-        <w:t>Technical Design Document: EmmanuelLugo__ProgrammingExercise_</w:t>
-      </w:r>
-      <w:r>
-        <w:t>7</w:t>
-      </w:r>
-      <w:r>
-        <w:t>.py</w:t>
+        <w:t>Technical Design Document: EmmanuelLugo__ProgrammingExercise_7.py</w:t>
       </w:r>
     </w:p>
     <w:p>
@@ -30,26 +24,411 @@
     </w:p>
     <w:p>
       <w:r>
-        <w:t>This program allow</w:t>
-      </w:r>
-      <w:r>
-        <w:t>s</w:t>
+        <w:t>This program allows a user to enter a paragraph, including sentences which begin with numbers. Display each individual sentence and the count of sentences in the paragraph. </w:t>
+      </w:r>
+    </w:p>
+    <w:p/>
+    <w:p>
+      <w:r>
+        <w:t xml:space="preserve">Function: </w:t>
+      </w:r>
+      <w:proofErr w:type="spellStart"/>
+      <w:r>
+        <w:t>seperate_sentences</w:t>
+      </w:r>
+      <w:proofErr w:type="spellEnd"/>
+      <w:r>
+        <w:t>(paragraph)</w:t>
+      </w:r>
+    </w:p>
+    <w:p>
+      <w:r>
+        <w:t>Description:</w:t>
+      </w:r>
+    </w:p>
+    <w:p>
+      <w:r>
+        <w:t xml:space="preserve">This function accepts raw string, applies specialized regular </w:t>
+      </w:r>
+      <w:r>
+        <w:t>expressions</w:t>
+      </w:r>
+      <w:r>
+        <w:t xml:space="preserve"> with specific flags, isolates complete sentences while safely ignoring periods.</w:t>
+      </w:r>
+    </w:p>
+    <w:p>
+      <w:r>
+        <w:t>Parameters:</w:t>
+      </w:r>
+    </w:p>
+    <w:p>
+      <w:pPr>
+        <w:pStyle w:val="ListParagraph"/>
+        <w:numPr>
+          <w:ilvl w:val="0"/>
+          <w:numId w:val="7"/>
+        </w:numPr>
+      </w:pPr>
+      <w:r>
+        <w:t>Raw sting from user.</w:t>
+      </w:r>
+    </w:p>
+    <w:p>
+      <w:r>
+        <w:t>Variables used:</w:t>
+      </w:r>
+    </w:p>
+    <w:p>
+      <w:pPr>
+        <w:pStyle w:val="ListParagraph"/>
+        <w:numPr>
+          <w:ilvl w:val="0"/>
+          <w:numId w:val="7"/>
+        </w:numPr>
+      </w:pPr>
+      <w:r>
+        <w:t>Pattern, raw look ahead regex string. r'[A-Z0-9</w:t>
+      </w:r>
+      <w:proofErr w:type="gramStart"/>
+      <w:r>
+        <w:t>].*?[</w:t>
+      </w:r>
+      <w:proofErr w:type="gramEnd"/>
+      <w:r>
+        <w:t>.!</w:t>
+      </w:r>
+      <w:proofErr w:type="gramStart"/>
+      <w:r>
+        <w:t>?](</w:t>
+      </w:r>
+      <w:proofErr w:type="gramEnd"/>
+      <w:r>
+        <w:t>?= [A-Z0-</w:t>
+      </w:r>
+      <w:proofErr w:type="gramStart"/>
+      <w:r>
+        <w:t>9]|</w:t>
+      </w:r>
+      <w:proofErr w:type="gramEnd"/>
+      <w:r>
+        <w:t>$)'.</w:t>
+      </w:r>
+    </w:p>
+    <w:p>
+      <w:pPr>
+        <w:pStyle w:val="ListParagraph"/>
+        <w:numPr>
+          <w:ilvl w:val="0"/>
+          <w:numId w:val="7"/>
+        </w:numPr>
+      </w:pPr>
+      <w:r>
+        <w:t>sentences (List of Strings): Stores list of individual sentences returned.</w:t>
+      </w:r>
+    </w:p>
+    <w:p>
+      <w:r>
+        <w:t>Logic:</w:t>
       </w:r>
       <w:r>
         <w:t xml:space="preserve"> </w:t>
       </w:r>
-      <w:r>
-        <w:t>a user</w:t>
-      </w:r>
-      <w:r>
-        <w:t xml:space="preserve"> to enter a paragraph, including sentences which begin with numbers. Display each individual sentence and the count of sentences in the paragraph. </w:t>
-      </w:r>
-    </w:p>
-    <w:p>
-      <w:r>
-        <w:t>Function: seperate_sentences(paragraph)</w:t>
-      </w:r>
-    </w:p>
+    </w:p>
+    <w:p>
+      <w:pPr>
+        <w:pStyle w:val="ListParagraph"/>
+        <w:numPr>
+          <w:ilvl w:val="0"/>
+          <w:numId w:val="7"/>
+        </w:numPr>
+      </w:pPr>
+      <w:r>
+        <w:t>D</w:t>
+      </w:r>
+      <w:r>
+        <w:t>efines the regex pattern</w:t>
+      </w:r>
+      <w:r>
+        <w:t>.</w:t>
+      </w:r>
+    </w:p>
+    <w:p>
+      <w:pPr>
+        <w:pStyle w:val="ListParagraph"/>
+        <w:numPr>
+          <w:ilvl w:val="0"/>
+          <w:numId w:val="7"/>
+        </w:numPr>
+      </w:pPr>
+      <w:r>
+        <w:t>P</w:t>
+      </w:r>
+      <w:r>
+        <w:t xml:space="preserve">asses the defined pattern into </w:t>
+      </w:r>
+      <w:proofErr w:type="spellStart"/>
+      <w:proofErr w:type="gramStart"/>
+      <w:r>
+        <w:t>re.findall</w:t>
+      </w:r>
+      <w:proofErr w:type="spellEnd"/>
+      <w:proofErr w:type="gramEnd"/>
+      <w:r>
+        <w:t>(), with the captured paragraph, the flags</w:t>
+      </w:r>
+      <w:proofErr w:type="gramStart"/>
+      <w:r>
+        <w:t>: .DOTALL</w:t>
+      </w:r>
+      <w:proofErr w:type="gramEnd"/>
+      <w:r>
+        <w:t xml:space="preserve"> (to recognize end of-line characters) and </w:t>
+      </w:r>
+      <w:r>
+        <w:t xml:space="preserve">MULTILINE (reads sentences on a newline and after a period). Using </w:t>
+      </w:r>
+      <w:proofErr w:type="gramStart"/>
+      <w:r>
+        <w:t>the .</w:t>
+      </w:r>
+      <w:proofErr w:type="spellStart"/>
+      <w:r>
+        <w:t>findall</w:t>
+      </w:r>
+      <w:proofErr w:type="spellEnd"/>
+      <w:proofErr w:type="gramEnd"/>
+      <w:r>
+        <w:t xml:space="preserve">(), we match upper case letters </w:t>
+      </w:r>
+      <w:proofErr w:type="spellStart"/>
+      <w:r>
+        <w:t>abd</w:t>
+      </w:r>
+      <w:proofErr w:type="spellEnd"/>
+      <w:r>
+        <w:t xml:space="preserve"> numbers, stop at punctuation, and </w:t>
+      </w:r>
+      <w:proofErr w:type="gramStart"/>
+      <w:r>
+        <w:t>verifies</w:t>
+      </w:r>
+      <w:proofErr w:type="gramEnd"/>
+      <w:r>
+        <w:t xml:space="preserve"> if a space or another sentence.</w:t>
+      </w:r>
+    </w:p>
+    <w:p>
+      <w:pPr>
+        <w:pStyle w:val="ListParagraph"/>
+        <w:numPr>
+          <w:ilvl w:val="0"/>
+          <w:numId w:val="7"/>
+        </w:numPr>
+      </w:pPr>
+      <w:r>
+        <w:t xml:space="preserve">Returns the result of </w:t>
+      </w:r>
+      <w:proofErr w:type="gramStart"/>
+      <w:r>
+        <w:t>the .</w:t>
+      </w:r>
+      <w:proofErr w:type="spellStart"/>
+      <w:r>
+        <w:t>findall</w:t>
+      </w:r>
+      <w:proofErr w:type="spellEnd"/>
+      <w:proofErr w:type="gramEnd"/>
+      <w:r>
+        <w:t>().</w:t>
+      </w:r>
+    </w:p>
+    <w:p/>
+    <w:p/>
+    <w:p/>
+    <w:p/>
+    <w:p/>
+    <w:p>
+      <w:r>
+        <w:lastRenderedPageBreak/>
+        <w:t xml:space="preserve">Function: </w:t>
+      </w:r>
+      <w:proofErr w:type="spellStart"/>
+      <w:r>
+        <w:t>display_sentence</w:t>
+      </w:r>
+      <w:proofErr w:type="spellEnd"/>
+      <w:r>
+        <w:t>(</w:t>
+      </w:r>
+      <w:proofErr w:type="spellStart"/>
+      <w:r>
+        <w:t>sentence_list</w:t>
+      </w:r>
+      <w:proofErr w:type="spellEnd"/>
+      <w:r>
+        <w:t>)</w:t>
+      </w:r>
+    </w:p>
+    <w:p>
+      <w:r>
+        <w:t xml:space="preserve">Description: </w:t>
+      </w:r>
+    </w:p>
+    <w:p>
+      <w:r>
+        <w:t xml:space="preserve">This function takes a list and iterates through each element in the list. Each element is printed for the user to see. Finally, once each element has been printed, it prints how many </w:t>
+      </w:r>
+      <w:r>
+        <w:t>items in the list</w:t>
+      </w:r>
+      <w:r>
+        <w:t xml:space="preserve"> were in the list. </w:t>
+      </w:r>
+    </w:p>
+    <w:p>
+      <w:r>
+        <w:t xml:space="preserve">In this case, the list is an isolated list of sentences that we will print and find the sum of the sentences from the list. </w:t>
+      </w:r>
+    </w:p>
+    <w:p/>
+    <w:p>
+      <w:r>
+        <w:t>Parameters:</w:t>
+      </w:r>
+    </w:p>
+    <w:p>
+      <w:pPr>
+        <w:pStyle w:val="ListParagraph"/>
+        <w:numPr>
+          <w:ilvl w:val="0"/>
+          <w:numId w:val="3"/>
+        </w:numPr>
+      </w:pPr>
+      <w:proofErr w:type="spellStart"/>
+      <w:r>
+        <w:t>Sentence_list</w:t>
+      </w:r>
+      <w:proofErr w:type="spellEnd"/>
+      <w:r>
+        <w:t xml:space="preserve"> – a list containing isolated sentences found within paragraph input. </w:t>
+      </w:r>
+    </w:p>
+    <w:p>
+      <w:r>
+        <w:t xml:space="preserve">Variables: </w:t>
+      </w:r>
+    </w:p>
+    <w:p>
+      <w:pPr>
+        <w:pStyle w:val="ListParagraph"/>
+        <w:numPr>
+          <w:ilvl w:val="0"/>
+          <w:numId w:val="3"/>
+        </w:numPr>
+      </w:pPr>
+      <w:r>
+        <w:t>none</w:t>
+      </w:r>
+    </w:p>
+    <w:p>
+      <w:r>
+        <w:t>Logic:</w:t>
+      </w:r>
+    </w:p>
+    <w:p>
+      <w:pPr>
+        <w:pStyle w:val="ListParagraph"/>
+        <w:numPr>
+          <w:ilvl w:val="0"/>
+          <w:numId w:val="3"/>
+        </w:numPr>
+      </w:pPr>
+      <w:r>
+        <w:t>Enter a l</w:t>
+      </w:r>
+      <w:r>
+        <w:t xml:space="preserve">oop and </w:t>
+      </w:r>
+      <w:r>
+        <w:t>iterate</w:t>
+      </w:r>
+      <w:r>
+        <w:t xml:space="preserve"> through a list</w:t>
+      </w:r>
+    </w:p>
+    <w:p>
+      <w:pPr>
+        <w:pStyle w:val="ListParagraph"/>
+        <w:numPr>
+          <w:ilvl w:val="0"/>
+          <w:numId w:val="3"/>
+        </w:numPr>
+      </w:pPr>
+      <w:r>
+        <w:t>Prints each element</w:t>
+      </w:r>
+    </w:p>
+    <w:p>
+      <w:pPr>
+        <w:pStyle w:val="ListParagraph"/>
+        <w:numPr>
+          <w:ilvl w:val="0"/>
+          <w:numId w:val="3"/>
+        </w:numPr>
+      </w:pPr>
+      <w:r>
+        <w:t xml:space="preserve">Once loop is finished, use </w:t>
+      </w:r>
+      <w:proofErr w:type="spellStart"/>
+      <w:proofErr w:type="gramStart"/>
+      <w:r>
+        <w:t>len</w:t>
+      </w:r>
+      <w:proofErr w:type="spellEnd"/>
+      <w:r>
+        <w:t>(</w:t>
+      </w:r>
+      <w:proofErr w:type="gramEnd"/>
+      <w:r>
+        <w:t xml:space="preserve">) on </w:t>
+      </w:r>
+      <w:proofErr w:type="spellStart"/>
+      <w:r>
+        <w:t>sentence_list</w:t>
+      </w:r>
+      <w:proofErr w:type="spellEnd"/>
+      <w:r>
+        <w:t xml:space="preserve"> and </w:t>
+      </w:r>
+      <w:r>
+        <w:t>print</w:t>
+      </w:r>
+      <w:r>
+        <w:t xml:space="preserve"> the count of the list, which is equal to how many sentences </w:t>
+      </w:r>
+      <w:r>
+        <w:t>are found</w:t>
+      </w:r>
+      <w:r>
+        <w:t xml:space="preserve"> within paragraph.</w:t>
+      </w:r>
+    </w:p>
+    <w:p/>
+    <w:p>
+      <w:r>
+        <w:t xml:space="preserve">Function: </w:t>
+      </w:r>
+      <w:proofErr w:type="gramStart"/>
+      <w:r>
+        <w:t>main(</w:t>
+      </w:r>
+      <w:proofErr w:type="gramEnd"/>
+      <w:r>
+        <w:t>)</w:t>
+      </w:r>
+    </w:p>
+    <w:p/>
     <w:p>
       <w:r>
         <w:t>Description:</w:t>
@@ -57,70 +436,156 @@
     </w:p>
     <w:p>
       <w:r>
-        <w:t xml:space="preserve">This function accepts raw string, applies </w:t>
-      </w:r>
-      <w:r>
-        <w:t>specialized regular expression</w:t>
+        <w:t>The main function</w:t>
       </w:r>
       <w:r>
         <w:t xml:space="preserve"> </w:t>
       </w:r>
-      <w:r>
-        <w:t>with specific flags</w:t>
-      </w:r>
-      <w:r>
-        <w:t xml:space="preserve">, </w:t>
-      </w:r>
-      <w:r>
-        <w:t>isolates complete sentences while safely ignoring periods</w:t>
-      </w:r>
-      <w:r>
-        <w:t>.</w:t>
+      <w:proofErr w:type="gramStart"/>
+      <w:r>
+        <w:t>that</w:t>
+      </w:r>
+      <w:proofErr w:type="gramEnd"/>
+      <w:r>
+        <w:t xml:space="preserve"> executes all other functions in this program after capturing input from the user. This input is the paragraph that we’ll have to iterate through to isolate the sentences.</w:t>
       </w:r>
     </w:p>
     <w:p>
       <w:r>
         <w:t>Parameters:</w:t>
       </w:r>
-    </w:p>
-    <w:p>
-      <w:r>
-        <w:t>Raw sting from user.</w:t>
-      </w:r>
-    </w:p>
-    <w:p>
-      <w:r>
-        <w:t>Variables used:</w:t>
-      </w:r>
-    </w:p>
-    <w:p>
-      <w:r>
-        <w:t xml:space="preserve">Pattern, raw look ahead regex string. </w:t>
-      </w:r>
-      <w:r>
-        <w:t>r'[A-Z0-9].*?[.!?](?= [A-Z0-9]|$)'.</w:t>
-      </w:r>
-    </w:p>
-    <w:p>
-      <w:r>
-        <w:t xml:space="preserve">sentences (List of Strings): Stores </w:t>
-      </w:r>
-      <w:r>
-        <w:t>list</w:t>
-      </w:r>
-      <w:r>
-        <w:t xml:space="preserve"> of individual sentences returned</w:t>
-      </w:r>
-      <w:r>
-        <w:t>.</w:t>
-      </w:r>
-    </w:p>
+      <w:r>
+        <w:t xml:space="preserve"> </w:t>
+      </w:r>
+    </w:p>
+    <w:p>
+      <w:pPr>
+        <w:pStyle w:val="ListParagraph"/>
+        <w:numPr>
+          <w:ilvl w:val="0"/>
+          <w:numId w:val="6"/>
+        </w:numPr>
+      </w:pPr>
+      <w:r>
+        <w:t>None</w:t>
+      </w:r>
+    </w:p>
+    <w:p/>
+    <w:p/>
+    <w:p>
+      <w:r>
+        <w:lastRenderedPageBreak/>
+        <w:t xml:space="preserve">Variables: </w:t>
+      </w:r>
+    </w:p>
+    <w:p>
+      <w:pPr>
+        <w:pStyle w:val="ListParagraph"/>
+        <w:numPr>
+          <w:ilvl w:val="0"/>
+          <w:numId w:val="6"/>
+        </w:numPr>
+      </w:pPr>
+      <w:r>
+        <w:t>paragraph</w:t>
+      </w:r>
+      <w:r>
+        <w:t xml:space="preserve">, the input captured by the user. </w:t>
+      </w:r>
+    </w:p>
+    <w:p>
+      <w:pPr>
+        <w:pStyle w:val="ListParagraph"/>
+        <w:numPr>
+          <w:ilvl w:val="0"/>
+          <w:numId w:val="6"/>
+        </w:numPr>
+      </w:pPr>
+      <w:r>
+        <w:t>S</w:t>
+      </w:r>
+      <w:r>
+        <w:t>entences</w:t>
+      </w:r>
+      <w:r>
+        <w:t xml:space="preserve">, list of sentences extracted from the paragraph. </w:t>
+      </w:r>
+    </w:p>
+    <w:p/>
     <w:p>
       <w:r>
         <w:t>Logic:</w:t>
       </w:r>
     </w:p>
+    <w:p>
+      <w:pPr>
+        <w:pStyle w:val="ListParagraph"/>
+        <w:numPr>
+          <w:ilvl w:val="0"/>
+          <w:numId w:val="5"/>
+        </w:numPr>
+      </w:pPr>
+      <w:r>
+        <w:t xml:space="preserve">Prompts the user to provide input, captures this information and stores the data </w:t>
+      </w:r>
+      <w:r>
+        <w:t>within a</w:t>
+      </w:r>
+      <w:r>
+        <w:t xml:space="preserve"> local variable</w:t>
+      </w:r>
+      <w:r>
+        <w:t xml:space="preserve"> “paragraph”.</w:t>
+      </w:r>
+    </w:p>
     <w:p/>
+    <w:p>
+      <w:pPr>
+        <w:pStyle w:val="ListParagraph"/>
+        <w:numPr>
+          <w:ilvl w:val="0"/>
+          <w:numId w:val="5"/>
+        </w:numPr>
+      </w:pPr>
+      <w:r>
+        <w:t xml:space="preserve">Calls </w:t>
+      </w:r>
+      <w:proofErr w:type="spellStart"/>
+      <w:r>
+        <w:t>separate_sentences</w:t>
+      </w:r>
+      <w:proofErr w:type="spellEnd"/>
+      <w:r>
+        <w:t>(paragraph), using the paragraph variable passed as an argument.</w:t>
+      </w:r>
+      <w:r>
+        <w:t xml:space="preserve"> Returns a list of sentences from the users input and stores this in a variable</w:t>
+      </w:r>
+    </w:p>
+    <w:p/>
+    <w:p>
+      <w:pPr>
+        <w:pStyle w:val="ListParagraph"/>
+        <w:numPr>
+          <w:ilvl w:val="0"/>
+          <w:numId w:val="5"/>
+        </w:numPr>
+      </w:pPr>
+      <w:r>
+        <w:t xml:space="preserve">Calls </w:t>
+      </w:r>
+      <w:proofErr w:type="spellStart"/>
+      <w:r>
+        <w:t>display_sentences</w:t>
+      </w:r>
+      <w:proofErr w:type="spellEnd"/>
+      <w:r>
+        <w:t>(</w:t>
+      </w:r>
+      <w:r>
+        <w:t xml:space="preserve">sentences), which takes the variable containing the list of sentences and iterates through this list to display each element. This function also returns the length. </w:t>
+      </w:r>
+    </w:p>
     <w:sectPr>
       <w:pgSz w:w="12240" w:h="15840"/>
       <w:pgMar w:top="1440" w:right="1440" w:bottom="1440" w:left="1440" w:header="720" w:footer="720" w:gutter="0"/>
@@ -134,6 +599,656 @@
 <file path=word/numbering.xml><?xml version="1.0" encoding="utf-8"?>
 <w:numbering xmlns:wpc="http://schemas.microsoft.com/office/word/2010/wordprocessingCanvas" xmlns:cx="http://schemas.microsoft.com/office/drawing/2014/chartex" xmlns:cx1="http://schemas.microsoft.com/office/drawing/2015/9/8/chartex" xmlns:cx2="http://schemas.microsoft.com/office/drawing/2015/10/21/chartex" xmlns:cx3="http://schemas.microsoft.com/office/drawing/2016/5/9/chartex" xmlns:cx4="http://schemas.microsoft.com/office/drawing/2016/5/10/chartex" xmlns:cx5="http://schemas.microsoft.com/office/drawing/2016/5/11/chartex" xmlns:cx6="http://schemas.microsoft.com/office/drawing/2016/5/12/chartex" xmlns:cx7="http://schemas.microsoft.com/office/drawing/2016/5/13/chartex" xmlns:cx8="http://schemas.microsoft.com/office/drawing/2016/5/14/chartex" xmlns:mc="http://schemas.openxmlformats.org/markup-compatibility/2006" xmlns:aink="http://schemas.microsoft.com/office/drawing/2016/ink" xmlns:am3d="http://schemas.microsoft.com/office/drawing/2017/model3d" xmlns:o="urn:schemas-microsoft-com:office:office" xmlns:oel="http://schemas.microsoft.com/office/2019/extlst" xmlns:r="http://schemas.openxmlformats.org/officeDocument/2006/relationships" xmlns:m="http://schemas.openxmlformats.org/officeDocument/2006/math" xmlns:v="urn:schemas-microsoft-com:vml" xmlns:wp14="http://schemas.microsoft.com/office/word/2010/wordprocessingDrawing" xmlns:wp="http://schemas.openxmlformats.org/drawingml/2006/wordprocessingDrawing" xmlns:w10="urn:schemas-microsoft-com:office:word" xmlns:w="http://schemas.openxmlformats.org/wordprocessingml/2006/main" xmlns:w14="http://schemas.microsoft.com/office/word/2010/wordml" xmlns:w15="http://schemas.microsoft.com/office/word/2012/wordml" xmlns:w16cex="http://schemas.microsoft.com/office/word/2018/wordml/cex" xmlns:w16cid="http://schemas.microsoft.com/office/word/2016/wordml/cid" xmlns:w16="http://schemas.microsoft.com/office/word/2018/wordml" xmlns:w16du="http://schemas.microsoft.com/office/word/2023/wordml/word16du" xmlns:w16sdtdh="http://schemas.microsoft.com/office/word/2020/wordml/sdtdatahash" xmlns:w16sdtfl="http://schemas.microsoft.com/office/word/2024/wordml/sdtformatlock" xmlns:w16se="http://schemas.microsoft.com/office/word/2015/wordml/symex" xmlns:wpg="http://schemas.microsoft.com/office/word/2010/wordprocessingGroup" xmlns:wpi="http://schemas.microsoft.com/office/word/2010/wordprocessingInk" xmlns:wne="http://schemas.microsoft.com/office/word/2006/wordml" xmlns:wps="http://schemas.microsoft.com/office/word/2010/wordprocessingShape" mc:Ignorable="w14 w15 w16se w16cid w16 w16cex w16sdtdh w16sdtfl w16du wp14">
   <w:abstractNum w:abstractNumId="0" w15:restartNumberingAfterBreak="0">
+    <w:nsid w:val="09E24E6A"/>
+    <w:multiLevelType w:val="hybridMultilevel"/>
+    <w:tmpl w:val="BA001C64"/>
+    <w:lvl w:ilvl="0" w:tplc="04090001">
+      <w:start w:val="1"/>
+      <w:numFmt w:val="bullet"/>
+      <w:lvlText w:val=""/>
+      <w:lvlJc w:val="left"/>
+      <w:pPr>
+        <w:ind w:left="720" w:hanging="360"/>
+      </w:pPr>
+      <w:rPr>
+        <w:rFonts w:ascii="Symbol" w:hAnsi="Symbol" w:hint="default"/>
+      </w:rPr>
+    </w:lvl>
+    <w:lvl w:ilvl="1" w:tplc="04090003" w:tentative="1">
+      <w:start w:val="1"/>
+      <w:numFmt w:val="bullet"/>
+      <w:lvlText w:val="o"/>
+      <w:lvlJc w:val="left"/>
+      <w:pPr>
+        <w:ind w:left="1440" w:hanging="360"/>
+      </w:pPr>
+      <w:rPr>
+        <w:rFonts w:ascii="Courier New" w:hAnsi="Courier New" w:cs="Courier New" w:hint="default"/>
+      </w:rPr>
+    </w:lvl>
+    <w:lvl w:ilvl="2" w:tplc="04090005" w:tentative="1">
+      <w:start w:val="1"/>
+      <w:numFmt w:val="bullet"/>
+      <w:lvlText w:val=""/>
+      <w:lvlJc w:val="left"/>
+      <w:pPr>
+        <w:ind w:left="2160" w:hanging="360"/>
+      </w:pPr>
+      <w:rPr>
+        <w:rFonts w:ascii="Wingdings" w:hAnsi="Wingdings" w:hint="default"/>
+      </w:rPr>
+    </w:lvl>
+    <w:lvl w:ilvl="3" w:tplc="04090001" w:tentative="1">
+      <w:start w:val="1"/>
+      <w:numFmt w:val="bullet"/>
+      <w:lvlText w:val=""/>
+      <w:lvlJc w:val="left"/>
+      <w:pPr>
+        <w:ind w:left="2880" w:hanging="360"/>
+      </w:pPr>
+      <w:rPr>
+        <w:rFonts w:ascii="Symbol" w:hAnsi="Symbol" w:hint="default"/>
+      </w:rPr>
+    </w:lvl>
+    <w:lvl w:ilvl="4" w:tplc="04090003" w:tentative="1">
+      <w:start w:val="1"/>
+      <w:numFmt w:val="bullet"/>
+      <w:lvlText w:val="o"/>
+      <w:lvlJc w:val="left"/>
+      <w:pPr>
+        <w:ind w:left="3600" w:hanging="360"/>
+      </w:pPr>
+      <w:rPr>
+        <w:rFonts w:ascii="Courier New" w:hAnsi="Courier New" w:cs="Courier New" w:hint="default"/>
+      </w:rPr>
+    </w:lvl>
+    <w:lvl w:ilvl="5" w:tplc="04090005" w:tentative="1">
+      <w:start w:val="1"/>
+      <w:numFmt w:val="bullet"/>
+      <w:lvlText w:val=""/>
+      <w:lvlJc w:val="left"/>
+      <w:pPr>
+        <w:ind w:left="4320" w:hanging="360"/>
+      </w:pPr>
+      <w:rPr>
+        <w:rFonts w:ascii="Wingdings" w:hAnsi="Wingdings" w:hint="default"/>
+      </w:rPr>
+    </w:lvl>
+    <w:lvl w:ilvl="6" w:tplc="04090001" w:tentative="1">
+      <w:start w:val="1"/>
+      <w:numFmt w:val="bullet"/>
+      <w:lvlText w:val=""/>
+      <w:lvlJc w:val="left"/>
+      <w:pPr>
+        <w:ind w:left="5040" w:hanging="360"/>
+      </w:pPr>
+      <w:rPr>
+        <w:rFonts w:ascii="Symbol" w:hAnsi="Symbol" w:hint="default"/>
+      </w:rPr>
+    </w:lvl>
+    <w:lvl w:ilvl="7" w:tplc="04090003" w:tentative="1">
+      <w:start w:val="1"/>
+      <w:numFmt w:val="bullet"/>
+      <w:lvlText w:val="o"/>
+      <w:lvlJc w:val="left"/>
+      <w:pPr>
+        <w:ind w:left="5760" w:hanging="360"/>
+      </w:pPr>
+      <w:rPr>
+        <w:rFonts w:ascii="Courier New" w:hAnsi="Courier New" w:cs="Courier New" w:hint="default"/>
+      </w:rPr>
+    </w:lvl>
+    <w:lvl w:ilvl="8" w:tplc="04090005" w:tentative="1">
+      <w:start w:val="1"/>
+      <w:numFmt w:val="bullet"/>
+      <w:lvlText w:val=""/>
+      <w:lvlJc w:val="left"/>
+      <w:pPr>
+        <w:ind w:left="6480" w:hanging="360"/>
+      </w:pPr>
+      <w:rPr>
+        <w:rFonts w:ascii="Wingdings" w:hAnsi="Wingdings" w:hint="default"/>
+      </w:rPr>
+    </w:lvl>
+  </w:abstractNum>
+  <w:abstractNum w:abstractNumId="1" w15:restartNumberingAfterBreak="0">
+    <w:nsid w:val="34E2079C"/>
+    <w:multiLevelType w:val="hybridMultilevel"/>
+    <w:tmpl w:val="36584540"/>
+    <w:lvl w:ilvl="0" w:tplc="0409000F">
+      <w:start w:val="1"/>
+      <w:numFmt w:val="decimal"/>
+      <w:lvlText w:val="%1."/>
+      <w:lvlJc w:val="left"/>
+      <w:pPr>
+        <w:ind w:left="720" w:hanging="360"/>
+      </w:pPr>
+    </w:lvl>
+    <w:lvl w:ilvl="1" w:tplc="04090019" w:tentative="1">
+      <w:start w:val="1"/>
+      <w:numFmt w:val="lowerLetter"/>
+      <w:lvlText w:val="%2."/>
+      <w:lvlJc w:val="left"/>
+      <w:pPr>
+        <w:ind w:left="1440" w:hanging="360"/>
+      </w:pPr>
+    </w:lvl>
+    <w:lvl w:ilvl="2" w:tplc="0409001B" w:tentative="1">
+      <w:start w:val="1"/>
+      <w:numFmt w:val="lowerRoman"/>
+      <w:lvlText w:val="%3."/>
+      <w:lvlJc w:val="right"/>
+      <w:pPr>
+        <w:ind w:left="2160" w:hanging="180"/>
+      </w:pPr>
+    </w:lvl>
+    <w:lvl w:ilvl="3" w:tplc="0409000F" w:tentative="1">
+      <w:start w:val="1"/>
+      <w:numFmt w:val="decimal"/>
+      <w:lvlText w:val="%4."/>
+      <w:lvlJc w:val="left"/>
+      <w:pPr>
+        <w:ind w:left="2880" w:hanging="360"/>
+      </w:pPr>
+    </w:lvl>
+    <w:lvl w:ilvl="4" w:tplc="04090019" w:tentative="1">
+      <w:start w:val="1"/>
+      <w:numFmt w:val="lowerLetter"/>
+      <w:lvlText w:val="%5."/>
+      <w:lvlJc w:val="left"/>
+      <w:pPr>
+        <w:ind w:left="3600" w:hanging="360"/>
+      </w:pPr>
+    </w:lvl>
+    <w:lvl w:ilvl="5" w:tplc="0409001B" w:tentative="1">
+      <w:start w:val="1"/>
+      <w:numFmt w:val="lowerRoman"/>
+      <w:lvlText w:val="%6."/>
+      <w:lvlJc w:val="right"/>
+      <w:pPr>
+        <w:ind w:left="4320" w:hanging="180"/>
+      </w:pPr>
+    </w:lvl>
+    <w:lvl w:ilvl="6" w:tplc="0409000F" w:tentative="1">
+      <w:start w:val="1"/>
+      <w:numFmt w:val="decimal"/>
+      <w:lvlText w:val="%7."/>
+      <w:lvlJc w:val="left"/>
+      <w:pPr>
+        <w:ind w:left="5040" w:hanging="360"/>
+      </w:pPr>
+    </w:lvl>
+    <w:lvl w:ilvl="7" w:tplc="04090019" w:tentative="1">
+      <w:start w:val="1"/>
+      <w:numFmt w:val="lowerLetter"/>
+      <w:lvlText w:val="%8."/>
+      <w:lvlJc w:val="left"/>
+      <w:pPr>
+        <w:ind w:left="5760" w:hanging="360"/>
+      </w:pPr>
+    </w:lvl>
+    <w:lvl w:ilvl="8" w:tplc="0409001B" w:tentative="1">
+      <w:start w:val="1"/>
+      <w:numFmt w:val="lowerRoman"/>
+      <w:lvlText w:val="%9."/>
+      <w:lvlJc w:val="right"/>
+      <w:pPr>
+        <w:ind w:left="6480" w:hanging="180"/>
+      </w:pPr>
+    </w:lvl>
+  </w:abstractNum>
+  <w:abstractNum w:abstractNumId="2" w15:restartNumberingAfterBreak="0">
+    <w:nsid w:val="3A0A4757"/>
+    <w:multiLevelType w:val="hybridMultilevel"/>
+    <w:tmpl w:val="3F60B642"/>
+    <w:lvl w:ilvl="0" w:tplc="04090001">
+      <w:start w:val="1"/>
+      <w:numFmt w:val="bullet"/>
+      <w:lvlText w:val=""/>
+      <w:lvlJc w:val="left"/>
+      <w:pPr>
+        <w:ind w:left="720" w:hanging="360"/>
+      </w:pPr>
+      <w:rPr>
+        <w:rFonts w:ascii="Symbol" w:hAnsi="Symbol" w:hint="default"/>
+      </w:rPr>
+    </w:lvl>
+    <w:lvl w:ilvl="1" w:tplc="04090003" w:tentative="1">
+      <w:start w:val="1"/>
+      <w:numFmt w:val="bullet"/>
+      <w:lvlText w:val="o"/>
+      <w:lvlJc w:val="left"/>
+      <w:pPr>
+        <w:ind w:left="1440" w:hanging="360"/>
+      </w:pPr>
+      <w:rPr>
+        <w:rFonts w:ascii="Courier New" w:hAnsi="Courier New" w:cs="Courier New" w:hint="default"/>
+      </w:rPr>
+    </w:lvl>
+    <w:lvl w:ilvl="2" w:tplc="04090005" w:tentative="1">
+      <w:start w:val="1"/>
+      <w:numFmt w:val="bullet"/>
+      <w:lvlText w:val=""/>
+      <w:lvlJc w:val="left"/>
+      <w:pPr>
+        <w:ind w:left="2160" w:hanging="360"/>
+      </w:pPr>
+      <w:rPr>
+        <w:rFonts w:ascii="Wingdings" w:hAnsi="Wingdings" w:hint="default"/>
+      </w:rPr>
+    </w:lvl>
+    <w:lvl w:ilvl="3" w:tplc="04090001" w:tentative="1">
+      <w:start w:val="1"/>
+      <w:numFmt w:val="bullet"/>
+      <w:lvlText w:val=""/>
+      <w:lvlJc w:val="left"/>
+      <w:pPr>
+        <w:ind w:left="2880" w:hanging="360"/>
+      </w:pPr>
+      <w:rPr>
+        <w:rFonts w:ascii="Symbol" w:hAnsi="Symbol" w:hint="default"/>
+      </w:rPr>
+    </w:lvl>
+    <w:lvl w:ilvl="4" w:tplc="04090003" w:tentative="1">
+      <w:start w:val="1"/>
+      <w:numFmt w:val="bullet"/>
+      <w:lvlText w:val="o"/>
+      <w:lvlJc w:val="left"/>
+      <w:pPr>
+        <w:ind w:left="3600" w:hanging="360"/>
+      </w:pPr>
+      <w:rPr>
+        <w:rFonts w:ascii="Courier New" w:hAnsi="Courier New" w:cs="Courier New" w:hint="default"/>
+      </w:rPr>
+    </w:lvl>
+    <w:lvl w:ilvl="5" w:tplc="04090005" w:tentative="1">
+      <w:start w:val="1"/>
+      <w:numFmt w:val="bullet"/>
+      <w:lvlText w:val=""/>
+      <w:lvlJc w:val="left"/>
+      <w:pPr>
+        <w:ind w:left="4320" w:hanging="360"/>
+      </w:pPr>
+      <w:rPr>
+        <w:rFonts w:ascii="Wingdings" w:hAnsi="Wingdings" w:hint="default"/>
+      </w:rPr>
+    </w:lvl>
+    <w:lvl w:ilvl="6" w:tplc="04090001" w:tentative="1">
+      <w:start w:val="1"/>
+      <w:numFmt w:val="bullet"/>
+      <w:lvlText w:val=""/>
+      <w:lvlJc w:val="left"/>
+      <w:pPr>
+        <w:ind w:left="5040" w:hanging="360"/>
+      </w:pPr>
+      <w:rPr>
+        <w:rFonts w:ascii="Symbol" w:hAnsi="Symbol" w:hint="default"/>
+      </w:rPr>
+    </w:lvl>
+    <w:lvl w:ilvl="7" w:tplc="04090003" w:tentative="1">
+      <w:start w:val="1"/>
+      <w:numFmt w:val="bullet"/>
+      <w:lvlText w:val="o"/>
+      <w:lvlJc w:val="left"/>
+      <w:pPr>
+        <w:ind w:left="5760" w:hanging="360"/>
+      </w:pPr>
+      <w:rPr>
+        <w:rFonts w:ascii="Courier New" w:hAnsi="Courier New" w:cs="Courier New" w:hint="default"/>
+      </w:rPr>
+    </w:lvl>
+    <w:lvl w:ilvl="8" w:tplc="04090005" w:tentative="1">
+      <w:start w:val="1"/>
+      <w:numFmt w:val="bullet"/>
+      <w:lvlText w:val=""/>
+      <w:lvlJc w:val="left"/>
+      <w:pPr>
+        <w:ind w:left="6480" w:hanging="360"/>
+      </w:pPr>
+      <w:rPr>
+        <w:rFonts w:ascii="Wingdings" w:hAnsi="Wingdings" w:hint="default"/>
+      </w:rPr>
+    </w:lvl>
+  </w:abstractNum>
+  <w:abstractNum w:abstractNumId="3" w15:restartNumberingAfterBreak="0">
+    <w:nsid w:val="3A38247A"/>
+    <w:multiLevelType w:val="hybridMultilevel"/>
+    <w:tmpl w:val="6A268A22"/>
+    <w:lvl w:ilvl="0" w:tplc="389036BE">
+      <w:numFmt w:val="bullet"/>
+      <w:lvlText w:val="-"/>
+      <w:lvlJc w:val="left"/>
+      <w:pPr>
+        <w:ind w:left="720" w:hanging="360"/>
+      </w:pPr>
+      <w:rPr>
+        <w:rFonts w:ascii="Aptos" w:eastAsiaTheme="minorHAnsi" w:hAnsi="Aptos" w:cstheme="minorBidi" w:hint="default"/>
+      </w:rPr>
+    </w:lvl>
+    <w:lvl w:ilvl="1" w:tplc="04090003">
+      <w:start w:val="1"/>
+      <w:numFmt w:val="bullet"/>
+      <w:lvlText w:val="o"/>
+      <w:lvlJc w:val="left"/>
+      <w:pPr>
+        <w:ind w:left="1440" w:hanging="360"/>
+      </w:pPr>
+      <w:rPr>
+        <w:rFonts w:ascii="Courier New" w:hAnsi="Courier New" w:cs="Courier New" w:hint="default"/>
+      </w:rPr>
+    </w:lvl>
+    <w:lvl w:ilvl="2" w:tplc="04090005" w:tentative="1">
+      <w:start w:val="1"/>
+      <w:numFmt w:val="bullet"/>
+      <w:lvlText w:val=""/>
+      <w:lvlJc w:val="left"/>
+      <w:pPr>
+        <w:ind w:left="2160" w:hanging="360"/>
+      </w:pPr>
+      <w:rPr>
+        <w:rFonts w:ascii="Wingdings" w:hAnsi="Wingdings" w:hint="default"/>
+      </w:rPr>
+    </w:lvl>
+    <w:lvl w:ilvl="3" w:tplc="04090001" w:tentative="1">
+      <w:start w:val="1"/>
+      <w:numFmt w:val="bullet"/>
+      <w:lvlText w:val=""/>
+      <w:lvlJc w:val="left"/>
+      <w:pPr>
+        <w:ind w:left="2880" w:hanging="360"/>
+      </w:pPr>
+      <w:rPr>
+        <w:rFonts w:ascii="Symbol" w:hAnsi="Symbol" w:hint="default"/>
+      </w:rPr>
+    </w:lvl>
+    <w:lvl w:ilvl="4" w:tplc="04090003" w:tentative="1">
+      <w:start w:val="1"/>
+      <w:numFmt w:val="bullet"/>
+      <w:lvlText w:val="o"/>
+      <w:lvlJc w:val="left"/>
+      <w:pPr>
+        <w:ind w:left="3600" w:hanging="360"/>
+      </w:pPr>
+      <w:rPr>
+        <w:rFonts w:ascii="Courier New" w:hAnsi="Courier New" w:cs="Courier New" w:hint="default"/>
+      </w:rPr>
+    </w:lvl>
+    <w:lvl w:ilvl="5" w:tplc="04090005" w:tentative="1">
+      <w:start w:val="1"/>
+      <w:numFmt w:val="bullet"/>
+      <w:lvlText w:val=""/>
+      <w:lvlJc w:val="left"/>
+      <w:pPr>
+        <w:ind w:left="4320" w:hanging="360"/>
+      </w:pPr>
+      <w:rPr>
+        <w:rFonts w:ascii="Wingdings" w:hAnsi="Wingdings" w:hint="default"/>
+      </w:rPr>
+    </w:lvl>
+    <w:lvl w:ilvl="6" w:tplc="04090001" w:tentative="1">
+      <w:start w:val="1"/>
+      <w:numFmt w:val="bullet"/>
+      <w:lvlText w:val=""/>
+      <w:lvlJc w:val="left"/>
+      <w:pPr>
+        <w:ind w:left="5040" w:hanging="360"/>
+      </w:pPr>
+      <w:rPr>
+        <w:rFonts w:ascii="Symbol" w:hAnsi="Symbol" w:hint="default"/>
+      </w:rPr>
+    </w:lvl>
+    <w:lvl w:ilvl="7" w:tplc="04090003" w:tentative="1">
+      <w:start w:val="1"/>
+      <w:numFmt w:val="bullet"/>
+      <w:lvlText w:val="o"/>
+      <w:lvlJc w:val="left"/>
+      <w:pPr>
+        <w:ind w:left="5760" w:hanging="360"/>
+      </w:pPr>
+      <w:rPr>
+        <w:rFonts w:ascii="Courier New" w:hAnsi="Courier New" w:cs="Courier New" w:hint="default"/>
+      </w:rPr>
+    </w:lvl>
+    <w:lvl w:ilvl="8" w:tplc="04090005" w:tentative="1">
+      <w:start w:val="1"/>
+      <w:numFmt w:val="bullet"/>
+      <w:lvlText w:val=""/>
+      <w:lvlJc w:val="left"/>
+      <w:pPr>
+        <w:ind w:left="6480" w:hanging="360"/>
+      </w:pPr>
+      <w:rPr>
+        <w:rFonts w:ascii="Wingdings" w:hAnsi="Wingdings" w:hint="default"/>
+      </w:rPr>
+    </w:lvl>
+  </w:abstractNum>
+  <w:abstractNum w:abstractNumId="4" w15:restartNumberingAfterBreak="0">
+    <w:nsid w:val="3A715221"/>
+    <w:multiLevelType w:val="hybridMultilevel"/>
+    <w:tmpl w:val="25DEFAB2"/>
+    <w:lvl w:ilvl="0" w:tplc="04090001">
+      <w:start w:val="1"/>
+      <w:numFmt w:val="bullet"/>
+      <w:lvlText w:val=""/>
+      <w:lvlJc w:val="left"/>
+      <w:pPr>
+        <w:ind w:left="720" w:hanging="360"/>
+      </w:pPr>
+      <w:rPr>
+        <w:rFonts w:ascii="Symbol" w:hAnsi="Symbol" w:hint="default"/>
+      </w:rPr>
+    </w:lvl>
+    <w:lvl w:ilvl="1" w:tplc="04090003" w:tentative="1">
+      <w:start w:val="1"/>
+      <w:numFmt w:val="bullet"/>
+      <w:lvlText w:val="o"/>
+      <w:lvlJc w:val="left"/>
+      <w:pPr>
+        <w:ind w:left="1440" w:hanging="360"/>
+      </w:pPr>
+      <w:rPr>
+        <w:rFonts w:ascii="Courier New" w:hAnsi="Courier New" w:cs="Courier New" w:hint="default"/>
+      </w:rPr>
+    </w:lvl>
+    <w:lvl w:ilvl="2" w:tplc="04090005" w:tentative="1">
+      <w:start w:val="1"/>
+      <w:numFmt w:val="bullet"/>
+      <w:lvlText w:val=""/>
+      <w:lvlJc w:val="left"/>
+      <w:pPr>
+        <w:ind w:left="2160" w:hanging="360"/>
+      </w:pPr>
+      <w:rPr>
+        <w:rFonts w:ascii="Wingdings" w:hAnsi="Wingdings" w:hint="default"/>
+      </w:rPr>
+    </w:lvl>
+    <w:lvl w:ilvl="3" w:tplc="04090001" w:tentative="1">
+      <w:start w:val="1"/>
+      <w:numFmt w:val="bullet"/>
+      <w:lvlText w:val=""/>
+      <w:lvlJc w:val="left"/>
+      <w:pPr>
+        <w:ind w:left="2880" w:hanging="360"/>
+      </w:pPr>
+      <w:rPr>
+        <w:rFonts w:ascii="Symbol" w:hAnsi="Symbol" w:hint="default"/>
+      </w:rPr>
+    </w:lvl>
+    <w:lvl w:ilvl="4" w:tplc="04090003" w:tentative="1">
+      <w:start w:val="1"/>
+      <w:numFmt w:val="bullet"/>
+      <w:lvlText w:val="o"/>
+      <w:lvlJc w:val="left"/>
+      <w:pPr>
+        <w:ind w:left="3600" w:hanging="360"/>
+      </w:pPr>
+      <w:rPr>
+        <w:rFonts w:ascii="Courier New" w:hAnsi="Courier New" w:cs="Courier New" w:hint="default"/>
+      </w:rPr>
+    </w:lvl>
+    <w:lvl w:ilvl="5" w:tplc="04090005" w:tentative="1">
+      <w:start w:val="1"/>
+      <w:numFmt w:val="bullet"/>
+      <w:lvlText w:val=""/>
+      <w:lvlJc w:val="left"/>
+      <w:pPr>
+        <w:ind w:left="4320" w:hanging="360"/>
+      </w:pPr>
+      <w:rPr>
+        <w:rFonts w:ascii="Wingdings" w:hAnsi="Wingdings" w:hint="default"/>
+      </w:rPr>
+    </w:lvl>
+    <w:lvl w:ilvl="6" w:tplc="04090001" w:tentative="1">
+      <w:start w:val="1"/>
+      <w:numFmt w:val="bullet"/>
+      <w:lvlText w:val=""/>
+      <w:lvlJc w:val="left"/>
+      <w:pPr>
+        <w:ind w:left="5040" w:hanging="360"/>
+      </w:pPr>
+      <w:rPr>
+        <w:rFonts w:ascii="Symbol" w:hAnsi="Symbol" w:hint="default"/>
+      </w:rPr>
+    </w:lvl>
+    <w:lvl w:ilvl="7" w:tplc="04090003" w:tentative="1">
+      <w:start w:val="1"/>
+      <w:numFmt w:val="bullet"/>
+      <w:lvlText w:val="o"/>
+      <w:lvlJc w:val="left"/>
+      <w:pPr>
+        <w:ind w:left="5760" w:hanging="360"/>
+      </w:pPr>
+      <w:rPr>
+        <w:rFonts w:ascii="Courier New" w:hAnsi="Courier New" w:cs="Courier New" w:hint="default"/>
+      </w:rPr>
+    </w:lvl>
+    <w:lvl w:ilvl="8" w:tplc="04090005" w:tentative="1">
+      <w:start w:val="1"/>
+      <w:numFmt w:val="bullet"/>
+      <w:lvlText w:val=""/>
+      <w:lvlJc w:val="left"/>
+      <w:pPr>
+        <w:ind w:left="6480" w:hanging="360"/>
+      </w:pPr>
+      <w:rPr>
+        <w:rFonts w:ascii="Wingdings" w:hAnsi="Wingdings" w:hint="default"/>
+      </w:rPr>
+    </w:lvl>
+  </w:abstractNum>
+  <w:abstractNum w:abstractNumId="5" w15:restartNumberingAfterBreak="0">
+    <w:nsid w:val="67AF6B62"/>
+    <w:multiLevelType w:val="hybridMultilevel"/>
+    <w:tmpl w:val="4FFE1918"/>
+    <w:lvl w:ilvl="0" w:tplc="04090001">
+      <w:start w:val="1"/>
+      <w:numFmt w:val="bullet"/>
+      <w:lvlText w:val=""/>
+      <w:lvlJc w:val="left"/>
+      <w:pPr>
+        <w:ind w:left="720" w:hanging="360"/>
+      </w:pPr>
+      <w:rPr>
+        <w:rFonts w:ascii="Symbol" w:hAnsi="Symbol" w:hint="default"/>
+      </w:rPr>
+    </w:lvl>
+    <w:lvl w:ilvl="1" w:tplc="04090003" w:tentative="1">
+      <w:start w:val="1"/>
+      <w:numFmt w:val="bullet"/>
+      <w:lvlText w:val="o"/>
+      <w:lvlJc w:val="left"/>
+      <w:pPr>
+        <w:ind w:left="1440" w:hanging="360"/>
+      </w:pPr>
+      <w:rPr>
+        <w:rFonts w:ascii="Courier New" w:hAnsi="Courier New" w:cs="Courier New" w:hint="default"/>
+      </w:rPr>
+    </w:lvl>
+    <w:lvl w:ilvl="2" w:tplc="04090005" w:tentative="1">
+      <w:start w:val="1"/>
+      <w:numFmt w:val="bullet"/>
+      <w:lvlText w:val=""/>
+      <w:lvlJc w:val="left"/>
+      <w:pPr>
+        <w:ind w:left="2160" w:hanging="360"/>
+      </w:pPr>
+      <w:rPr>
+        <w:rFonts w:ascii="Wingdings" w:hAnsi="Wingdings" w:hint="default"/>
+      </w:rPr>
+    </w:lvl>
+    <w:lvl w:ilvl="3" w:tplc="04090001" w:tentative="1">
+      <w:start w:val="1"/>
+      <w:numFmt w:val="bullet"/>
+      <w:lvlText w:val=""/>
+      <w:lvlJc w:val="left"/>
+      <w:pPr>
+        <w:ind w:left="2880" w:hanging="360"/>
+      </w:pPr>
+      <w:rPr>
+        <w:rFonts w:ascii="Symbol" w:hAnsi="Symbol" w:hint="default"/>
+      </w:rPr>
+    </w:lvl>
+    <w:lvl w:ilvl="4" w:tplc="04090003" w:tentative="1">
+      <w:start w:val="1"/>
+      <w:numFmt w:val="bullet"/>
+      <w:lvlText w:val="o"/>
+      <w:lvlJc w:val="left"/>
+      <w:pPr>
+        <w:ind w:left="3600" w:hanging="360"/>
+      </w:pPr>
+      <w:rPr>
+        <w:rFonts w:ascii="Courier New" w:hAnsi="Courier New" w:cs="Courier New" w:hint="default"/>
+      </w:rPr>
+    </w:lvl>
+    <w:lvl w:ilvl="5" w:tplc="04090005" w:tentative="1">
+      <w:start w:val="1"/>
+      <w:numFmt w:val="bullet"/>
+      <w:lvlText w:val=""/>
+      <w:lvlJc w:val="left"/>
+      <w:pPr>
+        <w:ind w:left="4320" w:hanging="360"/>
+      </w:pPr>
+      <w:rPr>
+        <w:rFonts w:ascii="Wingdings" w:hAnsi="Wingdings" w:hint="default"/>
+      </w:rPr>
+    </w:lvl>
+    <w:lvl w:ilvl="6" w:tplc="04090001" w:tentative="1">
+      <w:start w:val="1"/>
+      <w:numFmt w:val="bullet"/>
+      <w:lvlText w:val=""/>
+      <w:lvlJc w:val="left"/>
+      <w:pPr>
+        <w:ind w:left="5040" w:hanging="360"/>
+      </w:pPr>
+      <w:rPr>
+        <w:rFonts w:ascii="Symbol" w:hAnsi="Symbol" w:hint="default"/>
+      </w:rPr>
+    </w:lvl>
+    <w:lvl w:ilvl="7" w:tplc="04090003" w:tentative="1">
+      <w:start w:val="1"/>
+      <w:numFmt w:val="bullet"/>
+      <w:lvlText w:val="o"/>
+      <w:lvlJc w:val="left"/>
+      <w:pPr>
+        <w:ind w:left="5760" w:hanging="360"/>
+      </w:pPr>
+      <w:rPr>
+        <w:rFonts w:ascii="Courier New" w:hAnsi="Courier New" w:cs="Courier New" w:hint="default"/>
+      </w:rPr>
+    </w:lvl>
+    <w:lvl w:ilvl="8" w:tplc="04090005" w:tentative="1">
+      <w:start w:val="1"/>
+      <w:numFmt w:val="bullet"/>
+      <w:lvlText w:val=""/>
+      <w:lvlJc w:val="left"/>
+      <w:pPr>
+        <w:ind w:left="6480" w:hanging="360"/>
+      </w:pPr>
+      <w:rPr>
+        <w:rFonts w:ascii="Wingdings" w:hAnsi="Wingdings" w:hint="default"/>
+      </w:rPr>
+    </w:lvl>
+  </w:abstractNum>
+  <w:abstractNum w:abstractNumId="6" w15:restartNumberingAfterBreak="0">
     <w:nsid w:val="6B531DC4"/>
     <w:multiLevelType w:val="hybridMultilevel"/>
     <w:tmpl w:val="EE5248E4"/>
@@ -246,16 +1361,25 @@
     </w:lvl>
   </w:abstractNum>
   <w:num w:numId="1" w16cid:durableId="468983094">
+    <w:abstractNumId w:val="6"/>
+  </w:num>
+  <w:num w:numId="2" w16cid:durableId="1492287283">
+    <w:abstractNumId w:val="3"/>
+  </w:num>
+  <w:num w:numId="3" w16cid:durableId="720783285">
+    <w:abstractNumId w:val="4"/>
+  </w:num>
+  <w:num w:numId="4" w16cid:durableId="1020088116">
+    <w:abstractNumId w:val="1"/>
+  </w:num>
+  <w:num w:numId="5" w16cid:durableId="572737031">
+    <w:abstractNumId w:val="2"/>
+  </w:num>
+  <w:num w:numId="6" w16cid:durableId="349332903">
     <w:abstractNumId w:val="0"/>
-    <w:lvlOverride w:ilvl="0"/>
-    <w:lvlOverride w:ilvl="1"/>
-    <w:lvlOverride w:ilvl="2"/>
-    <w:lvlOverride w:ilvl="3"/>
-    <w:lvlOverride w:ilvl="4"/>
-    <w:lvlOverride w:ilvl="5"/>
-    <w:lvlOverride w:ilvl="6"/>
-    <w:lvlOverride w:ilvl="7"/>
-    <w:lvlOverride w:ilvl="8"/>
+  </w:num>
+  <w:num w:numId="7" w16cid:durableId="958687468">
+    <w:abstractNumId w:val="5"/>
   </w:num>
 </w:numbering>
 </file>
@@ -863,6 +1987,7 @@
   <w:style w:type="character" w:default="1" w:styleId="DefaultParagraphFont">
     <w:name w:val="Default Paragraph Font"/>
     <w:uiPriority w:val="1"/>
+    <w:semiHidden/>
     <w:unhideWhenUsed/>
   </w:style>
   <w:style w:type="table" w:default="1" w:styleId="TableNormal">

</xml_diff>